<commit_message>
updating the colordetect firmware
</commit_message>
<xml_diff>
--- a/Documentation/Getting_Started_Guide_Kria_Yocto_VitisVisionLibrary_App-v1_0.docx
+++ b/Documentation/Getting_Started_Guide_Kria_Yocto_VitisVisionLibrary_App-v1_0.docx
@@ -47,23 +47,7 @@
         <w:jc w:val="both"/>
       </w:pPr>
       <w:r>
-        <w:t xml:space="preserve">This </w:t>
-      </w:r>
-      <w:proofErr w:type="spellStart"/>
-      <w:r>
-        <w:t>kria</w:t>
-      </w:r>
-      <w:proofErr w:type="spellEnd"/>
-      <w:r>
-        <w:t xml:space="preserve"> app utilizes the Vitis Vision Library </w:t>
-      </w:r>
-      <w:proofErr w:type="spellStart"/>
-      <w:r>
-        <w:t>ColorDetect</w:t>
-      </w:r>
-      <w:proofErr w:type="spellEnd"/>
-      <w:r>
-        <w:t xml:space="preserve"> HLS kernel based on the MIPI data received from Raspberry Pi Camera v2.</w:t>
+        <w:t>This kria app utilizes the Vitis Vision Library ColorDetect HLS kernel based on the MIPI data received from Raspberry Pi Camera v2.</w:t>
       </w:r>
     </w:p>
     <w:p>
@@ -72,15 +56,7 @@
         <w:jc w:val="both"/>
       </w:pPr>
       <w:r>
-        <w:t xml:space="preserve">This system is running at Kria Yocto tool and in the </w:t>
-      </w:r>
-      <w:proofErr w:type="gramStart"/>
-      <w:r>
-        <w:t>background</w:t>
-      </w:r>
-      <w:proofErr w:type="gramEnd"/>
-      <w:r>
-        <w:t xml:space="preserve"> it uses 2025.2 Vitis acceleration flow for firmware development.</w:t>
+        <w:t>This system is running at Kria Yocto tool and in the background it uses 2025.2 Vitis acceleration flow for firmware development.</w:t>
       </w:r>
     </w:p>
     <w:p>
@@ -233,23 +209,7 @@
         <w:t>V</w:t>
       </w:r>
       <w:r>
-        <w:t xml:space="preserve">260 </w:t>
-      </w:r>
-      <w:proofErr w:type="gramStart"/>
-      <w:r>
-        <w:t>Board ,</w:t>
-      </w:r>
-      <w:proofErr w:type="gramEnd"/>
-      <w:r>
-        <w:t xml:space="preserve"> power </w:t>
-      </w:r>
-      <w:proofErr w:type="gramStart"/>
-      <w:r>
-        <w:t>adapter ,</w:t>
-      </w:r>
-      <w:proofErr w:type="gramEnd"/>
-      <w:r>
-        <w:t xml:space="preserve"> 16+ GB of SD Card </w:t>
+        <w:t xml:space="preserve">260 Board , power adapter , 16+ GB of SD Card </w:t>
       </w:r>
       <w:r>
         <w:t xml:space="preserve">– </w:t>
@@ -352,23 +312,7 @@
       </w:pPr>
       <w:r>
         <w:lastRenderedPageBreak/>
-        <w:t xml:space="preserve">Download and burn this </w:t>
-      </w:r>
-      <w:proofErr w:type="spellStart"/>
-      <w:r>
-        <w:t>wic</w:t>
-      </w:r>
-      <w:proofErr w:type="spellEnd"/>
-      <w:r>
-        <w:t xml:space="preserve"> image with </w:t>
-      </w:r>
-      <w:proofErr w:type="spellStart"/>
-      <w:r>
-        <w:t>BalenaEtcher</w:t>
-      </w:r>
-      <w:proofErr w:type="spellEnd"/>
-      <w:r>
-        <w:t xml:space="preserve"> - </w:t>
+        <w:t xml:space="preserve">Download and burn this wic image with BalenaEtcher - </w:t>
       </w:r>
       <w:hyperlink r:id="rId9" w:tooltip="https://account.amd.com/en/forms/downloads/member-xef.html?filename=kria-image-full-cmdline-kria-zynqmp-generic.rootfs-20251116094523.wic.xz" w:history="1">
         <w:r>
@@ -388,15 +332,7 @@
         </w:numPr>
       </w:pPr>
       <w:r>
-        <w:t xml:space="preserve">Update the </w:t>
-      </w:r>
-      <w:proofErr w:type="spellStart"/>
-      <w:r>
-        <w:t>bootfrimware</w:t>
-      </w:r>
-      <w:proofErr w:type="spellEnd"/>
-      <w:r>
-        <w:t xml:space="preserve"> - </w:t>
+        <w:t xml:space="preserve">Update the bootfrimware - </w:t>
       </w:r>
       <w:r>
         <w:t>01.05 K24 Boot FW Update or later</w:t>
@@ -404,7 +340,7 @@
       <w:r>
         <w:t xml:space="preserve">. Follow boot image recovery tool - </w:t>
       </w:r>
-      <w:hyperlink r:id="rId10" w:history="1">
+      <w:hyperlink r:id="rId10" w:anchor="Boot-Image-Recovery-Tool" w:history="1">
         <w:r>
           <w:rPr>
             <w:rStyle w:val="Hyperlink"/>
@@ -425,15 +361,7 @@
         </w:numPr>
       </w:pPr>
       <w:r>
-        <w:t>Now plug the SD card to KV</w:t>
-      </w:r>
-      <w:proofErr w:type="gramStart"/>
-      <w:r>
-        <w:t>260 ,</w:t>
-      </w:r>
-      <w:proofErr w:type="gramEnd"/>
-      <w:r>
-        <w:t xml:space="preserve"> connect Power adapter, Raspberry Piv2 MIPI camera and boot the board.</w:t>
+        <w:t>Now plug the SD card to KV260 , connect Power adapter, Raspberry Piv2 MIPI camera and boot the board.</w:t>
       </w:r>
     </w:p>
     <w:p>
@@ -561,29 +489,13 @@
         </w:numPr>
       </w:pPr>
       <w:r>
-        <w:t xml:space="preserve">You can use </w:t>
-      </w:r>
-      <w:proofErr w:type="spellStart"/>
-      <w:r>
-        <w:t>Moba</w:t>
+        <w:t>You can use Moba</w:t>
       </w:r>
       <w:r>
         <w:t>x</w:t>
       </w:r>
       <w:r>
-        <w:t>term</w:t>
-      </w:r>
-      <w:proofErr w:type="spellEnd"/>
-      <w:r>
-        <w:t>/</w:t>
-      </w:r>
-      <w:proofErr w:type="spellStart"/>
-      <w:r>
-        <w:t>Teraterm</w:t>
-      </w:r>
-      <w:proofErr w:type="spellEnd"/>
-      <w:r>
-        <w:t xml:space="preserve"> in </w:t>
+        <w:t xml:space="preserve">term/Teraterm in </w:t>
       </w:r>
       <w:r>
         <w:rPr>
@@ -595,15 +507,7 @@
         <w:t>Windows</w:t>
       </w:r>
       <w:r>
-        <w:t xml:space="preserve"> or </w:t>
-      </w:r>
-      <w:proofErr w:type="spellStart"/>
-      <w:r>
-        <w:t>Gtkterm</w:t>
-      </w:r>
-      <w:proofErr w:type="spellEnd"/>
-      <w:r>
-        <w:t xml:space="preserve"> in </w:t>
+        <w:t xml:space="preserve"> or Gtkterm in </w:t>
       </w:r>
       <w:r>
         <w:rPr>
@@ -627,15 +531,7 @@
         </w:numPr>
       </w:pPr>
       <w:r>
-        <w:t xml:space="preserve">Connect the </w:t>
-      </w:r>
-      <w:proofErr w:type="spellStart"/>
-      <w:r>
-        <w:t>baudrate</w:t>
-      </w:r>
-      <w:proofErr w:type="spellEnd"/>
-      <w:r>
-        <w:t xml:space="preserve"> of </w:t>
+        <w:t xml:space="preserve">Connect the baudrate of </w:t>
       </w:r>
       <w:r>
         <w:rPr>
@@ -692,23 +588,7 @@
           <w:b/>
           <w:bCs/>
         </w:rPr>
-        <w:t xml:space="preserve">and </w:t>
-      </w:r>
-      <w:proofErr w:type="spellStart"/>
-      <w:r>
-        <w:rPr>
-          <w:b/>
-          <w:bCs/>
-        </w:rPr>
-        <w:t>Raspbery</w:t>
-      </w:r>
-      <w:proofErr w:type="spellEnd"/>
-      <w:r>
-        <w:rPr>
-          <w:b/>
-          <w:bCs/>
-        </w:rPr>
-        <w:t xml:space="preserve"> Pi v2</w:t>
+        <w:t>and Raspbery Pi v2</w:t>
       </w:r>
       <w:r>
         <w:rPr>
@@ -794,15 +674,7 @@
         <w:jc w:val="both"/>
       </w:pPr>
       <w:r>
-        <w:t xml:space="preserve">After </w:t>
-      </w:r>
-      <w:proofErr w:type="gramStart"/>
-      <w:r>
-        <w:t>booting ,</w:t>
-      </w:r>
-      <w:proofErr w:type="gramEnd"/>
-      <w:r>
-        <w:t xml:space="preserve"> you will start getting boot log from </w:t>
+        <w:t xml:space="preserve">After booting , you will start getting boot log from </w:t>
       </w:r>
       <w:r>
         <w:t>Yocto EDF</w:t>
@@ -834,13 +706,8 @@
         <w:jc w:val="both"/>
       </w:pPr>
       <w:r>
-        <w:t xml:space="preserve">Username: </w:t>
-      </w:r>
-      <w:proofErr w:type="spellStart"/>
-      <w:r>
-        <w:t>amd-edf</w:t>
-      </w:r>
-      <w:proofErr w:type="spellEnd"/>
+        <w:t>Username: amd-edf</w:t>
+      </w:r>
     </w:p>
     <w:p>
       <w:pPr>
@@ -891,7 +758,6 @@
       <w:r>
         <w:t xml:space="preserve">260’s IP address by running the </w:t>
       </w:r>
-      <w:proofErr w:type="spellStart"/>
       <w:r>
         <w:rPr>
           <w:b/>
@@ -901,7 +767,6 @@
         </w:rPr>
         <w:t>ifconfig</w:t>
       </w:r>
-      <w:proofErr w:type="spellEnd"/>
       <w:r>
         <w:t xml:space="preserve"> command</w:t>
       </w:r>
@@ -932,13 +797,8 @@
         <w:pStyle w:val="Heading2"/>
       </w:pPr>
       <w:r>
-        <w:t xml:space="preserve">Clone </w:t>
-      </w:r>
-      <w:proofErr w:type="spellStart"/>
-      <w:r>
-        <w:t>Github</w:t>
-      </w:r>
-      <w:proofErr w:type="spellEnd"/>
+        <w:t>Clone Github</w:t>
+      </w:r>
       <w:r>
         <w:t xml:space="preserve"> Repository</w:t>
       </w:r>
@@ -948,15 +808,7 @@
         <w:ind w:left="720"/>
       </w:pPr>
       <w:r>
-        <w:t xml:space="preserve">Clone this </w:t>
-      </w:r>
-      <w:proofErr w:type="spellStart"/>
-      <w:r>
-        <w:t>github</w:t>
-      </w:r>
-      <w:proofErr w:type="spellEnd"/>
-      <w:r>
-        <w:t xml:space="preserve"> repository at the KR260-Ubuntu</w:t>
+        <w:t>Clone this github repository at the KR260-Ubuntu</w:t>
       </w:r>
       <w:r>
         <w:t xml:space="preserve"> image</w:t>
@@ -1028,6 +880,65 @@
       </w:pPr>
       <w:r>
         <w:lastRenderedPageBreak/>
+        <w:t>Setup OpenCV, Media-ctl , V4L2 and utilities</w:t>
+      </w:r>
+    </w:p>
+    <w:p>
+      <w:r>
+        <w:t>The AMD-EDF image needs to setup for OpenCV and other utilities.</w:t>
+      </w:r>
+    </w:p>
+    <w:p>
+      <w:r>
+        <w:t>One can use the dnf approach to install those:</w:t>
+      </w:r>
+    </w:p>
+    <w:p>
+      <w:pPr>
+        <w:pStyle w:val="ListParagraph"/>
+        <w:numPr>
+          <w:ilvl w:val="0"/>
+          <w:numId w:val="9"/>
+        </w:numPr>
+      </w:pPr>
+      <w:r>
+        <w:t>dnf repolist</w:t>
+      </w:r>
+    </w:p>
+    <w:p>
+      <w:pPr>
+        <w:pStyle w:val="ListParagraph"/>
+        <w:numPr>
+          <w:ilvl w:val="0"/>
+          <w:numId w:val="9"/>
+        </w:numPr>
+      </w:pPr>
+      <w:r>
+        <w:t>dnf install opencv</w:t>
+      </w:r>
+    </w:p>
+    <w:p>
+      <w:pPr>
+        <w:pStyle w:val="ListParagraph"/>
+        <w:numPr>
+          <w:ilvl w:val="0"/>
+          <w:numId w:val="9"/>
+        </w:numPr>
+      </w:pPr>
+      <w:r>
+        <w:t>dnf install -y v4l-utils</w:t>
+      </w:r>
+    </w:p>
+    <w:p>
+      <w:pPr>
+        <w:pStyle w:val="ListParagraph"/>
+      </w:pPr>
+    </w:p>
+    <w:p>
+      <w:pPr>
+        <w:pStyle w:val="Heading2"/>
+      </w:pPr>
+      <w:r>
         <w:t>Run the Application</w:t>
       </w:r>
     </w:p>
@@ -1133,29 +1044,8 @@
         <w:pStyle w:val="Heading2"/>
       </w:pPr>
       <w:r>
-        <w:t xml:space="preserve">Compare the Accelerated </w:t>
-      </w:r>
-      <w:proofErr w:type="spellStart"/>
-      <w:r>
-        <w:t>ColorDetect</w:t>
-      </w:r>
-      <w:proofErr w:type="spellEnd"/>
-      <w:r>
-        <w:t xml:space="preserve"> and OpenCV </w:t>
-      </w:r>
-      <w:proofErr w:type="spellStart"/>
-      <w:r>
-        <w:t>ColorDetect</w:t>
-      </w:r>
-      <w:proofErr w:type="spellEnd"/>
-      <w:r>
-        <w:t xml:space="preserve"> at PS of </w:t>
-      </w:r>
-      <w:proofErr w:type="spellStart"/>
-      <w:r>
-        <w:t>MPSoC</w:t>
-      </w:r>
-      <w:proofErr w:type="spellEnd"/>
+        <w:t>Compare the Accelerated ColorDetect and OpenCV ColorDetect at PS of MPSoC</w:t>
+      </w:r>
     </w:p>
     <w:p>
       <w:pPr>
@@ -1340,11 +1230,9 @@
             <w:tcW w:w="587" w:type="dxa"/>
           </w:tcPr>
           <w:p>
-            <w:proofErr w:type="gramStart"/>
             <w:r>
               <w:t>S.N</w:t>
             </w:r>
-            <w:proofErr w:type="gramEnd"/>
           </w:p>
         </w:tc>
         <w:tc>
@@ -2295,6 +2183,119 @@
     </w:lvl>
   </w:abstractNum>
   <w:abstractNum w:abstractNumId="4" w15:restartNumberingAfterBreak="0">
+    <w:nsid w:val="2DAF3BF0"/>
+    <w:multiLevelType w:val="hybridMultilevel"/>
+    <w:tmpl w:val="58F4EE5A"/>
+    <w:lvl w:ilvl="0" w:tplc="04090001">
+      <w:start w:val="1"/>
+      <w:numFmt w:val="bullet"/>
+      <w:lvlText w:val=""/>
+      <w:lvlJc w:val="left"/>
+      <w:pPr>
+        <w:ind w:left="720" w:hanging="360"/>
+      </w:pPr>
+      <w:rPr>
+        <w:rFonts w:ascii="Symbol" w:hAnsi="Symbol" w:hint="default"/>
+      </w:rPr>
+    </w:lvl>
+    <w:lvl w:ilvl="1" w:tplc="04090003" w:tentative="1">
+      <w:start w:val="1"/>
+      <w:numFmt w:val="bullet"/>
+      <w:lvlText w:val="o"/>
+      <w:lvlJc w:val="left"/>
+      <w:pPr>
+        <w:ind w:left="1440" w:hanging="360"/>
+      </w:pPr>
+      <w:rPr>
+        <w:rFonts w:ascii="Courier New" w:hAnsi="Courier New" w:cs="Courier New" w:hint="default"/>
+      </w:rPr>
+    </w:lvl>
+    <w:lvl w:ilvl="2" w:tplc="04090005" w:tentative="1">
+      <w:start w:val="1"/>
+      <w:numFmt w:val="bullet"/>
+      <w:lvlText w:val=""/>
+      <w:lvlJc w:val="left"/>
+      <w:pPr>
+        <w:ind w:left="2160" w:hanging="360"/>
+      </w:pPr>
+      <w:rPr>
+        <w:rFonts w:ascii="Wingdings" w:hAnsi="Wingdings" w:hint="default"/>
+      </w:rPr>
+    </w:lvl>
+    <w:lvl w:ilvl="3" w:tplc="04090001" w:tentative="1">
+      <w:start w:val="1"/>
+      <w:numFmt w:val="bullet"/>
+      <w:lvlText w:val=""/>
+      <w:lvlJc w:val="left"/>
+      <w:pPr>
+        <w:ind w:left="2880" w:hanging="360"/>
+      </w:pPr>
+      <w:rPr>
+        <w:rFonts w:ascii="Symbol" w:hAnsi="Symbol" w:hint="default"/>
+      </w:rPr>
+    </w:lvl>
+    <w:lvl w:ilvl="4" w:tplc="04090003" w:tentative="1">
+      <w:start w:val="1"/>
+      <w:numFmt w:val="bullet"/>
+      <w:lvlText w:val="o"/>
+      <w:lvlJc w:val="left"/>
+      <w:pPr>
+        <w:ind w:left="3600" w:hanging="360"/>
+      </w:pPr>
+      <w:rPr>
+        <w:rFonts w:ascii="Courier New" w:hAnsi="Courier New" w:cs="Courier New" w:hint="default"/>
+      </w:rPr>
+    </w:lvl>
+    <w:lvl w:ilvl="5" w:tplc="04090005" w:tentative="1">
+      <w:start w:val="1"/>
+      <w:numFmt w:val="bullet"/>
+      <w:lvlText w:val=""/>
+      <w:lvlJc w:val="left"/>
+      <w:pPr>
+        <w:ind w:left="4320" w:hanging="360"/>
+      </w:pPr>
+      <w:rPr>
+        <w:rFonts w:ascii="Wingdings" w:hAnsi="Wingdings" w:hint="default"/>
+      </w:rPr>
+    </w:lvl>
+    <w:lvl w:ilvl="6" w:tplc="04090001" w:tentative="1">
+      <w:start w:val="1"/>
+      <w:numFmt w:val="bullet"/>
+      <w:lvlText w:val=""/>
+      <w:lvlJc w:val="left"/>
+      <w:pPr>
+        <w:ind w:left="5040" w:hanging="360"/>
+      </w:pPr>
+      <w:rPr>
+        <w:rFonts w:ascii="Symbol" w:hAnsi="Symbol" w:hint="default"/>
+      </w:rPr>
+    </w:lvl>
+    <w:lvl w:ilvl="7" w:tplc="04090003" w:tentative="1">
+      <w:start w:val="1"/>
+      <w:numFmt w:val="bullet"/>
+      <w:lvlText w:val="o"/>
+      <w:lvlJc w:val="left"/>
+      <w:pPr>
+        <w:ind w:left="5760" w:hanging="360"/>
+      </w:pPr>
+      <w:rPr>
+        <w:rFonts w:ascii="Courier New" w:hAnsi="Courier New" w:cs="Courier New" w:hint="default"/>
+      </w:rPr>
+    </w:lvl>
+    <w:lvl w:ilvl="8" w:tplc="04090005" w:tentative="1">
+      <w:start w:val="1"/>
+      <w:numFmt w:val="bullet"/>
+      <w:lvlText w:val=""/>
+      <w:lvlJc w:val="left"/>
+      <w:pPr>
+        <w:ind w:left="6480" w:hanging="360"/>
+      </w:pPr>
+      <w:rPr>
+        <w:rFonts w:ascii="Wingdings" w:hAnsi="Wingdings" w:hint="default"/>
+      </w:rPr>
+    </w:lvl>
+  </w:abstractNum>
+  <w:abstractNum w:abstractNumId="5" w15:restartNumberingAfterBreak="0">
     <w:nsid w:val="33980BEB"/>
     <w:multiLevelType w:val="hybridMultilevel"/>
     <w:tmpl w:val="3F54CE1C"/>
@@ -2383,7 +2384,7 @@
       </w:pPr>
     </w:lvl>
   </w:abstractNum>
-  <w:abstractNum w:abstractNumId="5" w15:restartNumberingAfterBreak="0">
+  <w:abstractNum w:abstractNumId="6" w15:restartNumberingAfterBreak="0">
     <w:nsid w:val="3BCC4335"/>
     <w:multiLevelType w:val="hybridMultilevel"/>
     <w:tmpl w:val="30601ED8"/>
@@ -2473,7 +2474,120 @@
       </w:pPr>
     </w:lvl>
   </w:abstractNum>
-  <w:abstractNum w:abstractNumId="6" w15:restartNumberingAfterBreak="0">
+  <w:abstractNum w:abstractNumId="7" w15:restartNumberingAfterBreak="0">
+    <w:nsid w:val="44535B8D"/>
+    <w:multiLevelType w:val="hybridMultilevel"/>
+    <w:tmpl w:val="11CE884A"/>
+    <w:lvl w:ilvl="0" w:tplc="04090001">
+      <w:start w:val="1"/>
+      <w:numFmt w:val="bullet"/>
+      <w:lvlText w:val=""/>
+      <w:lvlJc w:val="left"/>
+      <w:pPr>
+        <w:ind w:left="720" w:hanging="360"/>
+      </w:pPr>
+      <w:rPr>
+        <w:rFonts w:ascii="Symbol" w:hAnsi="Symbol" w:hint="default"/>
+      </w:rPr>
+    </w:lvl>
+    <w:lvl w:ilvl="1" w:tplc="04090003" w:tentative="1">
+      <w:start w:val="1"/>
+      <w:numFmt w:val="bullet"/>
+      <w:lvlText w:val="o"/>
+      <w:lvlJc w:val="left"/>
+      <w:pPr>
+        <w:ind w:left="1440" w:hanging="360"/>
+      </w:pPr>
+      <w:rPr>
+        <w:rFonts w:ascii="Courier New" w:hAnsi="Courier New" w:cs="Courier New" w:hint="default"/>
+      </w:rPr>
+    </w:lvl>
+    <w:lvl w:ilvl="2" w:tplc="04090005" w:tentative="1">
+      <w:start w:val="1"/>
+      <w:numFmt w:val="bullet"/>
+      <w:lvlText w:val=""/>
+      <w:lvlJc w:val="left"/>
+      <w:pPr>
+        <w:ind w:left="2160" w:hanging="360"/>
+      </w:pPr>
+      <w:rPr>
+        <w:rFonts w:ascii="Wingdings" w:hAnsi="Wingdings" w:hint="default"/>
+      </w:rPr>
+    </w:lvl>
+    <w:lvl w:ilvl="3" w:tplc="04090001" w:tentative="1">
+      <w:start w:val="1"/>
+      <w:numFmt w:val="bullet"/>
+      <w:lvlText w:val=""/>
+      <w:lvlJc w:val="left"/>
+      <w:pPr>
+        <w:ind w:left="2880" w:hanging="360"/>
+      </w:pPr>
+      <w:rPr>
+        <w:rFonts w:ascii="Symbol" w:hAnsi="Symbol" w:hint="default"/>
+      </w:rPr>
+    </w:lvl>
+    <w:lvl w:ilvl="4" w:tplc="04090003" w:tentative="1">
+      <w:start w:val="1"/>
+      <w:numFmt w:val="bullet"/>
+      <w:lvlText w:val="o"/>
+      <w:lvlJc w:val="left"/>
+      <w:pPr>
+        <w:ind w:left="3600" w:hanging="360"/>
+      </w:pPr>
+      <w:rPr>
+        <w:rFonts w:ascii="Courier New" w:hAnsi="Courier New" w:cs="Courier New" w:hint="default"/>
+      </w:rPr>
+    </w:lvl>
+    <w:lvl w:ilvl="5" w:tplc="04090005" w:tentative="1">
+      <w:start w:val="1"/>
+      <w:numFmt w:val="bullet"/>
+      <w:lvlText w:val=""/>
+      <w:lvlJc w:val="left"/>
+      <w:pPr>
+        <w:ind w:left="4320" w:hanging="360"/>
+      </w:pPr>
+      <w:rPr>
+        <w:rFonts w:ascii="Wingdings" w:hAnsi="Wingdings" w:hint="default"/>
+      </w:rPr>
+    </w:lvl>
+    <w:lvl w:ilvl="6" w:tplc="04090001" w:tentative="1">
+      <w:start w:val="1"/>
+      <w:numFmt w:val="bullet"/>
+      <w:lvlText w:val=""/>
+      <w:lvlJc w:val="left"/>
+      <w:pPr>
+        <w:ind w:left="5040" w:hanging="360"/>
+      </w:pPr>
+      <w:rPr>
+        <w:rFonts w:ascii="Symbol" w:hAnsi="Symbol" w:hint="default"/>
+      </w:rPr>
+    </w:lvl>
+    <w:lvl w:ilvl="7" w:tplc="04090003" w:tentative="1">
+      <w:start w:val="1"/>
+      <w:numFmt w:val="bullet"/>
+      <w:lvlText w:val="o"/>
+      <w:lvlJc w:val="left"/>
+      <w:pPr>
+        <w:ind w:left="5760" w:hanging="360"/>
+      </w:pPr>
+      <w:rPr>
+        <w:rFonts w:ascii="Courier New" w:hAnsi="Courier New" w:cs="Courier New" w:hint="default"/>
+      </w:rPr>
+    </w:lvl>
+    <w:lvl w:ilvl="8" w:tplc="04090005" w:tentative="1">
+      <w:start w:val="1"/>
+      <w:numFmt w:val="bullet"/>
+      <w:lvlText w:val=""/>
+      <w:lvlJc w:val="left"/>
+      <w:pPr>
+        <w:ind w:left="6480" w:hanging="360"/>
+      </w:pPr>
+      <w:rPr>
+        <w:rFonts w:ascii="Wingdings" w:hAnsi="Wingdings" w:hint="default"/>
+      </w:rPr>
+    </w:lvl>
+  </w:abstractNum>
+  <w:abstractNum w:abstractNumId="8" w15:restartNumberingAfterBreak="0">
     <w:nsid w:val="4FAA78FE"/>
     <w:multiLevelType w:val="hybridMultilevel"/>
     <w:tmpl w:val="7F848938"/>
@@ -2566,13 +2680,13 @@
     </w:lvl>
   </w:abstractNum>
   <w:num w:numId="1" w16cid:durableId="1635135217">
-    <w:abstractNumId w:val="5"/>
+    <w:abstractNumId w:val="6"/>
   </w:num>
   <w:num w:numId="2" w16cid:durableId="968323349">
-    <w:abstractNumId w:val="6"/>
+    <w:abstractNumId w:val="8"/>
   </w:num>
   <w:num w:numId="3" w16cid:durableId="1350178717">
-    <w:abstractNumId w:val="4"/>
+    <w:abstractNumId w:val="5"/>
   </w:num>
   <w:num w:numId="4" w16cid:durableId="1606572357">
     <w:abstractNumId w:val="0"/>
@@ -2585,6 +2699,12 @@
   </w:num>
   <w:num w:numId="7" w16cid:durableId="1522014757">
     <w:abstractNumId w:val="1"/>
+  </w:num>
+  <w:num w:numId="8" w16cid:durableId="1331982334">
+    <w:abstractNumId w:val="4"/>
+  </w:num>
+  <w:num w:numId="9" w16cid:durableId="234246727">
+    <w:abstractNumId w:val="7"/>
   </w:num>
 </w:numbering>
 </file>
@@ -3194,6 +3314,7 @@
   <w:style w:type="character" w:default="1" w:styleId="DefaultParagraphFont">
     <w:name w:val="Default Paragraph Font"/>
     <w:uiPriority w:val="1"/>
+    <w:semiHidden/>
     <w:unhideWhenUsed/>
   </w:style>
   <w:style w:type="table" w:default="1" w:styleId="TableNormal">

</xml_diff>